<commit_message>
Beat the S+ tree with ClusterJump; sharpen the fusion tree write-up
Adds the S+ tree, RadixJump, SplineIndex and ClusterJump, plus clustered keys in bench_pred. Plan fixed before timing and confirmed on three fresh seeds: at 2^25 ClusterJump beats the S+ tree on clustered keys in throughput (0.40) and latency (0.92), and in throughput on uniform keys (0.45). 20,400,000 tree checks, zero failures.

Report and README: lead with the binary-search crossover and its cause, state the 18-run design, the VTune exclusion rule, and that K ~ 6 at 256 bits applies only to the multiplication sketch.
</commit_message>
<xml_diff>
--- a/Experiments_Report_2026-09-10.docx
+++ b/Experiments_Report_2026-09-10.docx
@@ -49,6 +49,66 @@
       </w:r>
       <w:r>
         <w:t xml:space="preserve"> When searches can overlap (throughput), the fusion tree was 2.0–4.4× slower. When each search must wait for the previous one (latency), it was 1.83× slower at 256 keys and 1.23× slower at 33.5 million.</w:t>
+      </w:r>
+    </w:p>
+    <w:p>
+      <w:pPr>
+        <w:spacing w:after="120"/>
+      </w:pPr>
+      <w:r>
+        <w:rPr>
+          <w:b/>
+          <w:bCs/>
+        </w:rPr>
+        <w:t xml:space="preserve">It does beat binary search at large sizes, which is where the theory says it should — but a plain B-tree does so sooner, and that says why.</w:t>
+      </w:r>
+      <w:r>
+        <w:t xml:space="preserve"> From 2</w:t>
+      </w:r>
+      <w:r>
+        <w:rPr>
+          <w:vertAlign w:val="superscript"/>
+        </w:rPr>
+        <w:t xml:space="preserve">22</w:t>
+      </w:r>
+      <w:r>
+        <w:t xml:space="preserve"> keys in latency and 2</w:t>
+      </w:r>
+      <w:r>
+        <w:rPr>
+          <w:vertAlign w:val="superscript"/>
+        </w:rPr>
+        <w:t xml:space="preserve">24</w:t>
+      </w:r>
+      <w:r>
+        <w:t xml:space="preserve"> in throughput, the fusion tree is faster than binary search (0.41× and 0.80× its time at 2</w:t>
+      </w:r>
+      <w:r>
+        <w:rPr>
+          <w:vertAlign w:val="superscript"/>
+        </w:rPr>
+        <w:t xml:space="preserve">25</w:t>
+      </w:r>
+      <w:r>
+        <w:t xml:space="preserve">). Binary search is the method the Ω(log n) comparison lower bound describes, and the one Fredman and Willard set out to beat, so the 1993 claim is visible on real hardware. But the early-exit B-tree is also purely comparison-based, bound by the same Ω(log n), and it overtakes binary search earlier (from 2</w:t>
+      </w:r>
+      <w:r>
+        <w:rPr>
+          <w:vertAlign w:val="superscript"/>
+        </w:rPr>
+        <w:t xml:space="preserve">21</w:t>
+      </w:r>
+      <w:r>
+        <w:t xml:space="preserve"> in latency and 2</w:t>
+      </w:r>
+      <w:r>
+        <w:rPr>
+          <w:vertAlign w:val="superscript"/>
+        </w:rPr>
+        <w:t xml:space="preserve">23</w:t>
+      </w:r>
+      <w:r>
+        <w:t xml:space="preserve"> in throughput) and by more. What beats binary search here is a multiway node a few cache lines long, not an escape from the comparison model: the lower bound counts comparisons, while the time on this machine goes into moving memory, and in the external-memory model B-trees are already optimal. At w = 64 the fusion tree’s own advantage cannot show at all. Its asymptotic gain is a factor of log w in tree height, but K ≤ 8 gives it exactly the height of an 8-key B-tree, which leaves only the cost of searching one node, and that it loses.</w:t>
       </w:r>
     </w:p>
     <w:p>
@@ -309,7 +369,7 @@
                 <w:sz w:val="19"/>
                 <w:szCs w:val="19"/>
               </w:rPr>
-              <w:t xml:space="preserve">: 10 structures, 2</w:t>
+              <w:t xml:space="preserve">: each run times 10 structures × 18 sizes (2</w:t>
             </w:r>
             <w:r>
               <w:rPr>
@@ -339,7 +399,7 @@
                 <w:sz w:val="19"/>
                 <w:szCs w:val="19"/>
               </w:rPr>
-              <w:t xml:space="preserve"> keys, 3 sessions, 2 compilers, 2 modes, 2 run orders (18 runs, 48,600 timings), plus your own replication run.</w:t>
+              <w:t xml:space="preserve">) × 15 repetitions = 2,700 timings; 6 configurations × 3 sessions = 18 runs, 48,600 timings. The 6 configurations are g++ in both modes and both run orders, and clang in both modes in shuffled order only: 6 of the 8 cells of a fully crossed compiler × mode × order design. Plus your own replication run.</w:t>
             </w:r>
           </w:p>
         </w:tc>
@@ -4764,7 +4824,22 @@
         <w:t xml:space="preserve">On a 64-bit word the classical node works only up to K = 4</w:t>
       </w:r>
       <w:r>
-        <w:t xml:space="preserve"> (K = 5: 22.6%; K = 8: 0%). Even a 256-bit word only reaches K ≈ 6 reliably (K = 8: 55.5%; K = 16: 0.0%). The fusion trees measured below exist only because of PEXT, an instruction added in 2013 that computes the sketch exactly.</w:t>
+        <w:t xml:space="preserve"> (K = 5: 22.6%; K = 8: 0%). Even a 256-bit word only reaches K ≈ 6 reliably with this sketch (K = 8: 55.5%; K = 16: 0.0%). The fusion trees measured below exist only because of PEXT, an instruction added in 2013 that computes the sketch exactly.</w:t>
+      </w:r>
+    </w:p>
+    <w:p>
+      <w:pPr>
+        <w:spacing w:after="120"/>
+      </w:pPr>
+      <w:r>
+        <w:rPr>
+          <w:b/>
+          <w:bCs/>
+        </w:rPr>
+        <w:t xml:space="preserve">These limits belong to the multiplication sketch, not to fusion nodes in general.</w:t>
+      </w:r>
+      <w:r>
+        <w:t xml:space="preserve"> A PEXT sketch packs the important bits side by side, K − 1 bits per field, so the only limit is K² ≤ w: K = 8 on a 64-bit word and K = 16 on a 256-bit word. That is why the 16-key node of §6 can exist even though the 1993 construction stops near K = 6 at 256 bits. The two claims do not conflict; they describe two different ways of computing a sketch.</w:t>
       </w:r>
     </w:p>
     <w:p>
@@ -4782,6 +4857,21 @@
       </w:pPr>
       <w:r>
         <w:t xml:space="preserve">Conditions: performance core 8, pinned from inside the program; mains power; 15 repetitions per size, 65,536 queries each; 3 sessions (11 September, 16:04–16:33; session 2 was rerun after a profiling run overlapped it), each with its own random keys (seeds 20260909–20260911). Figures show the median of the three session medians; bands and ranges show the spread across sessions, which is a more honest error bar than the spread within one run.</w:t>
+      </w:r>
+    </w:p>
+    <w:p>
+      <w:pPr>
+        <w:spacing w:after="120"/>
+      </w:pPr>
+      <w:r>
+        <w:rPr>
+          <w:b/>
+          <w:bCs/>
+        </w:rPr>
+        <w:t xml:space="preserve">The design is not fully crossed.</w:t>
+      </w:r>
+      <w:r>
+        <w:t xml:space="preserve"> Each session ran 6 configurations: g++ in throughput and latency, each in shuffled and blocked order, and clang in throughput and latency in shuffled order only. So 6 configurations × 3 sessions = 18 runs, each 10 structures × 18 sizes × 15 repetitions = 2,700 timings, for 48,600 in all. A full compiler × mode × order design would have 8 configurations (64,800 timings); the missing cells are clang in blocked order, so run-order effects are measured under g++ only.</w:t>
       </w:r>
     </w:p>
     <w:p>
@@ -17954,7 +18044,24 @@
         <w:spacing w:after="120"/>
       </w:pPr>
       <w:r>
-        <w:t xml:space="preserve">An earlier pair of profiles was discarded. The fusion collection had shared the core with the timing campaign, which stretched its wall clock from 6.3 s to 82.8 s and inflated its stalls: 831 cycles per search against 730, and memory bound 50.1% against 43.8%. Both columns in the table above come from the clean re-collection; the file results/vtune_counters.csv keeps all four runs, with the discarded pair marked.</w:t>
+        <w:rPr>
+          <w:b/>
+          <w:bCs/>
+        </w:rPr>
+        <w:t xml:space="preserve">Which profiles count, and why.</w:t>
+      </w:r>
+      <w:r>
+        <w:t xml:space="preserve"> Four collections were made and two are used. The exclusion rule is: a collection is excluded if it ran while another benchmark was pinned to the same core, judged from its timestamps against the campaign log. </w:t>
+      </w:r>
+      <w:r>
+        <w:rPr>
+          <w:b/>
+          <w:bCs/>
+        </w:rPr>
+        <w:t xml:space="preserve">That rule was not fixed in advance.</w:t>
+      </w:r>
+      <w:r>
+        <w:t xml:space="preserve"> It was applied after the first pair’s counters had been seen, when the fusion collection turned out to have overlapped session 2 of the timing campaign on core 8; its wall clock was 82.8 s against 6.3 s for the re-collection. Two things limit the damage. The rule looks only at timestamps, never at counter values. And the excluded data points the same way: 443 instructions per search against 441 (within 1%), and 831 cycles against 730, which would have made the fusion tree look worse, not better (cycle ratio 2.87× against 2.51×). The B-tree collection of that pair showed no sign of overlap (2.952 s against 2.947 s, instructions and cycles within 1%) but was re-collected too, so both structures come from the same idle window. Given the rule came late, read the instruction and cycle counts as solid, because they barely differ between the excluded and the used runs, and everything below them as indicative. results/vtune_counters.csv keeps all four runs, marked.</w:t>
       </w:r>
     </w:p>
     <w:p>
@@ -17979,7 +18086,7 @@
         <w:spacing w:after="120"/>
       </w:pPr>
       <w:r>
-        <w:t xml:space="preserve">A 256-bit AVX2 register allows K = 16 keys per fusion node (K² ≤ w). This does help the fusion tree against its own 8-key version in the middle sizes (ratio 0.52 at 2</w:t>
+        <w:t xml:space="preserve">A 256-bit AVX2 register allows K = 16 keys per fusion node (K² ≤ w) when the sketch is computed with PEXT, as it is here; the K ≈ 6 limit of §3 applies only to the 1993 multiplication sketch. This does help the fusion tree against its own 8-key version in the middle sizes (ratio 0.52 at 2</w:t>
       </w:r>
       <w:r>
         <w:rPr>
@@ -18006,7 +18113,7 @@
         <w:t xml:space="preserve">25</w:t>
       </w:r>
       <w:r>
-        <w:t xml:space="preserve">, and against a 16-key B-tree built the same way 2.27× and 1.23×. Its node search is the slowest measured (84.4 cycles of latency): moving data between the ordinary and the vector registers costs more than the wider comparison saves. And §3 showed the 1993 construction cannot fill a 256-bit word either. </w:t>
+        <w:t xml:space="preserve">, and against a 16-key B-tree built the same way 2.27× and 1.23×. Its node search is the slowest measured (84.4 cycles of latency): moving data between the ordinary and the vector registers costs more than the wider comparison saves. And without PEXT it could not be built at all: §3 showed the multiplication sketch stops near K = 6 on 256 bits. </w:t>
       </w:r>
       <w:r>
         <w:rPr>
@@ -21655,10 +21762,10 @@
           <w:b/>
           <w:bCs/>
         </w:rPr>
-        <w:t xml:space="preserve">Against binary search the fusion tree does win at large sizes</w:t>
+        <w:t xml:space="preserve">Against binary search the fusion tree wins at large sizes</w:t>
       </w:r>
       <w:r>
-        <w:t xml:space="preserve"> — from 2</w:t>
+        <w:t xml:space="preserve"> (see “The answer”). Counting a crossover only where the ratio is below 1 in every session: from 2</w:t>
       </w:r>
       <w:r>
         <w:rPr>
@@ -21676,16 +21783,16 @@
         <w:t xml:space="preserve">24</w:t>
       </w:r>
       <w:r>
-        <w:t xml:space="preserve"> in throughput (ratio 0.41 and 0.80 at 2</w:t>
+        <w:t xml:space="preserve"> in throughput. The comparison-based B-trees get there sooner: both B-trees beat binary search at every size from 2</w:t>
       </w:r>
       <w:r>
         <w:rPr>
           <w:vertAlign w:val="superscript"/>
         </w:rPr>
-        <w:t xml:space="preserve">25</w:t>
+        <w:t xml:space="preserve">21</w:t>
       </w:r>
       <w:r>
-        <w:t xml:space="preserve">). This is the tree shape, not the fusion trick: every B-tree beats binary search at those sizes, and by more.</w:t>
+        <w:t xml:space="preserve"> in latency.</w:t>
       </w:r>
     </w:p>
     <w:p>
@@ -24926,6 +25033,46 @@
           <w:b/>
           <w:bCs/>
         </w:rPr>
+        <w:t xml:space="preserve">Not fully crossed.</w:t>
+      </w:r>
+      <w:r>
+        <w:t xml:space="preserve"> Run order was varied under g++ only; clang ran in shuffled order only (§4). The g++ blocked runs and the factorial in §8.2 are the evidence that order does not move the ratios.</w:t>
+      </w:r>
+    </w:p>
+    <w:p>
+      <w:pPr>
+        <w:pStyle w:val="ListParagraph"/>
+        <w:numPr>
+          <w:ilvl w:val="0"/>
+          <w:numId w:val="2"/>
+        </w:numPr>
+        <w:spacing w:after="60"/>
+      </w:pPr>
+      <w:r>
+        <w:rPr>
+          <w:b/>
+          <w:bCs/>
+        </w:rPr>
+        <w:t xml:space="preserve">The VTune exclusion rule was set after the first counters were seen</w:t>
+      </w:r>
+      <w:r>
+        <w:t xml:space="preserve"> (§5.5). It depends only on timestamps, and the excluded runs agree on instructions, so the conclusion does not rest on it.</w:t>
+      </w:r>
+    </w:p>
+    <w:p>
+      <w:pPr>
+        <w:pStyle w:val="ListParagraph"/>
+        <w:numPr>
+          <w:ilvl w:val="0"/>
+          <w:numId w:val="2"/>
+        </w:numPr>
+        <w:spacing w:after="60"/>
+      </w:pPr>
+      <w:r>
+        <w:rPr>
+          <w:b/>
+          <w:bCs/>
+        </w:rPr>
         <w:t xml:space="preserve">Static trees only.</w:t>
       </w:r>
       <w:r>
@@ -24966,7 +25113,25 @@
         <w:spacing w:after="120"/>
       </w:pPr>
       <w:r>
-        <w:t xml:space="preserve">*“On a 2025 laptop CPU, a correctly implemented fusion tree was 2.0–4.4 times slower than a cache-conscious B-tree when searches can overlap, and 1.2–2.0 times slower when they cannot, at every size from 2</w:t>
+        <w:t xml:space="preserve">*“On a 2025 laptop CPU, a correctly implemented fusion tree beat binary search, the comparison-based method its lower-bound argument targets, from 2</w:t>
+      </w:r>
+      <w:r>
+        <w:rPr>
+          <w:vertAlign w:val="superscript"/>
+        </w:rPr>
+        <w:t xml:space="preserve">22</w:t>
+      </w:r>
+      <w:r>
+        <w:t xml:space="preserve"> keys when searches cannot overlap and from 2</w:t>
+      </w:r>
+      <w:r>
+        <w:rPr>
+          <w:vertAlign w:val="superscript"/>
+        </w:rPr>
+        <w:t xml:space="preserve">24</w:t>
+      </w:r>
+      <w:r>
+        <w:t xml:space="preserve"> when they can. It never beat a cache-conscious B-tree: it was 2.0–4.4 times slower when searches overlap and 1.2–2.0 times slower when they cannot, at every size from 2</w:t>
       </w:r>
       <w:r>
         <w:rPr>
@@ -24984,7 +25149,7 @@
         <w:t xml:space="preserve">25</w:t>
       </w:r>
       <w:r>
-        <w:t xml:space="preserve"> keys. Its deficit grows in absolute terms with the input size, so no crossover exists at any input size; the cause is the fusion node’s search itself, whose dependency chain is about twice as long as a vectorised B-tree node’s, rather than memory traffic, which accounts for only 5–17 percent.”*</w:t>
+        <w:t xml:space="preserve"> keys, with a deficit that grows in absolute terms. A plain comparison-based B-tree beats binary search sooner, so the win over binary search comes from multiway, cache-line-sized nodes rather than from word-level parallelism; the fusion node’s own search has a dependency chain about twice as long as a vectorised B-tree node’s, and memory traffic accounts for only 5–17 percent of the gap.”*</w:t>
       </w:r>
     </w:p>
     <w:p>
@@ -25081,32 +25246,10 @@
           <w:b/>
           <w:bCs/>
         </w:rPr>
-        <w:t xml:space="preserve">One clean final run</w:t>
+        <w:t xml:space="preserve">Optional: fill the two missing cells</w:t>
       </w:r>
       <w:r>
-        <w:t xml:space="preserve"> before submission: </w:t>
-      </w:r>
-      <w:r>
-        <w:rPr>
-          <w:rFonts w:ascii="Consolas" w:cs="Consolas" w:eastAsia="Consolas" w:hAnsi="Consolas"/>
-          <w:sz w:val="19"/>
-          <w:szCs w:val="19"/>
-        </w:rPr>
-        <w:t xml:space="preserve">powershell -ExecutionPolicy Bypass -File analysis/final_campaign.ps1</w:t>
-      </w:r>
-      <w:r>
-        <w:t xml:space="preserve">, with nothing else open, then </w:t>
-      </w:r>
-      <w:r>
-        <w:rPr>
-          <w:rFonts w:ascii="Consolas" w:cs="Consolas" w:eastAsia="Consolas" w:hAnsi="Consolas"/>
-          <w:sz w:val="19"/>
-          <w:szCs w:val="19"/>
-        </w:rPr>
-        <w:t xml:space="preserve">Rscript analysis/final.R results/final_v2 v2</w:t>
-      </w:r>
-      <w:r>
-        <w:t xml:space="preserve">.</w:t>
+        <w:t xml:space="preserve"> (clang in blocked order) if a reviewer asks for a fully crossed design. Nothing in §8.2 suggests they would change a ratio.</w:t>
       </w:r>
     </w:p>
     <w:p>

</xml_diff>